<commit_message>
Movies gets a Universal studio card, biography, signature films, and Mission Brief like the TV networks; TV guide covers required pitches, rival bids, slots, and the homework flow
Co-Authored-By: Claude Opus 5.5 <noreply@anthropic.com>
</commit_message>
<xml_diff>
--- a/docs/The_Slate_Student_Guide_TV_Streaming.docx
+++ b/docs/The_Slate_Student_Guide_TV_Streaming.docx
@@ -406,6 +406,89 @@
                 <w:b w:val="0"/>
               </w:rPr>
               <w:t>Your budget is tied to how you're doing. Beat the margin target and next year's budget grows faster. Miss it and the budget shrinks. One bad year makes the next year harder.</w:t>
+            </w:r>
+          </w:p>
+        </w:tc>
+      </w:tr>
+    </w:tbl>
+    <w:p>
+      <w:pPr>
+        <w:spacing w:after="0"/>
+      </w:pPr>
+    </w:p>
+    <w:tbl>
+      <w:tblPr>
+        <w:tblW w:type="auto" w:w="0"/>
+        <w:jc w:val="center"/>
+        <w:tblLook w:firstColumn="1" w:firstRow="1" w:lastColumn="0" w:lastRow="0" w:noHBand="0" w:noVBand="1" w:val="04A0"/>
+      </w:tblPr>
+      <w:tblGrid>
+        <w:gridCol w:w="9360"/>
+      </w:tblGrid>
+      <w:tr>
+        <w:tc>
+          <w:tcPr>
+            <w:tcW w:type="dxa" w:w="9360"/>
+            <w:shd w:val="clear" w:color="auto" w:fill="E8F1FA"/>
+          </w:tcPr>
+          <w:p>
+            <w:pPr>
+              <w:spacing w:before="60" w:after="60"/>
+            </w:pPr>
+            <w:r>
+              <w:rPr>
+                <w:b/>
+                <w:sz w:val="20"/>
+              </w:rPr>
+              <w:t xml:space="preserve">TIP:  </w:t>
+            </w:r>
+            <w:r>
+              <w:rPr>
+                <w:b/>
+              </w:rPr>
+              <w:t>Check your syllabus for which network is due when.</w:t>
+            </w:r>
+            <w:r>
+              <w:rPr>
+                <w:b w:val="0"/>
+              </w:rPr>
+              <w:t xml:space="preserve"> A common setup: play </w:t>
+            </w:r>
+            <w:r>
+              <w:rPr>
+                <w:b/>
+              </w:rPr>
+              <w:t>Oxygen as homework</w:t>
+            </w:r>
+            <w:r>
+              <w:rPr>
+                <w:b w:val="0"/>
+              </w:rPr>
+              <w:t xml:space="preserve"> and submit it, then play </w:t>
+            </w:r>
+            <w:r>
+              <w:rPr>
+                <w:b/>
+              </w:rPr>
+              <w:t>Bravo or Peacock in class</w:t>
+            </w:r>
+            <w:r>
+              <w:rPr>
+                <w:b w:val="0"/>
+              </w:rPr>
+              <w:t xml:space="preserve">. You can open any network directly from the </w:t>
+            </w:r>
+            <w:r>
+              <w:rPr>
+                <w:b/>
+              </w:rPr>
+              <w:t>Choose Your Network</w:t>
+            </w:r>
+            <w:r>
+              <w:rPr>
+                <w:b w:val="0"/>
+              </w:rPr>
+              <w:t xml:space="preserve"> screen.</w:t>
             </w:r>
           </w:p>
         </w:tc>
@@ -2004,7 +2087,43 @@
         <w:rPr>
           <w:b w:val="0"/>
         </w:rPr>
-        <w:t>: buy a ready-made concept from the marketplace. Each one lists its audience, whether it's an international format, and any brand sponsor (sponsors lower the price).</w:t>
+        <w:t xml:space="preserve">: buy a ready-made concept from the marketplace. Each one lists its audience, whether it's an international format, and any brand sponsor (sponsors lower the price). Some show </w:t>
+      </w:r>
+      <w:r>
+        <w:rPr>
+          <w:b/>
+        </w:rPr>
+        <w:t>🔥 Competitor interest</w:t>
+      </w:r>
+      <w:r>
+        <w:rPr>
+          <w:b w:val="0"/>
+        </w:rPr>
+        <w:t xml:space="preserve">: a rival network is bidding, so winning it now costs </w:t>
+      </w:r>
+      <w:r>
+        <w:rPr>
+          <w:b/>
+        </w:rPr>
+        <w:t>25% more</w:t>
+      </w:r>
+      <w:r>
+        <w:rPr>
+          <w:b w:val="0"/>
+        </w:rPr>
+        <w:t xml:space="preserve">, and if you pass, there's a </w:t>
+      </w:r>
+      <w:r>
+        <w:rPr>
+          <w:b/>
+        </w:rPr>
+        <w:t>50% chance</w:t>
+      </w:r>
+      <w:r>
+        <w:rPr>
+          <w:b w:val="0"/>
+        </w:rPr>
+        <w:t xml:space="preserve"> each year the rival signs it and it's gone for good.</w:t>
       </w:r>
     </w:p>
     <w:p>
@@ -2021,7 +2140,7 @@
         <w:rPr>
           <w:b w:val="0"/>
         </w:rPr>
-        <w:t xml:space="preserve">: fill in the </w:t>
+        <w:t xml:space="preserve">: name it, fill in the </w:t>
       </w:r>
       <w:r>
         <w:rPr>
@@ -2033,20 +2152,67 @@
         <w:rPr>
           <w:b w:val="0"/>
         </w:rPr>
-        <w:t xml:space="preserve"> (genre, episodes, cost per episode, expected rating). Then compare the </w:t>
+        <w:t xml:space="preserve"> (genre, episodes, cost per episode, expected rating), and </w:t>
       </w:r>
       <w:r>
         <w:rPr>
           <w:b/>
         </w:rPr>
-        <w:t>Platform P&amp;L</w:t>
+        <w:t>write a 2–4 sentence pitch</w:t>
       </w:r>
       <w:r>
         <w:rPr>
           <w:b w:val="0"/>
         </w:rPr>
-        <w:t xml:space="preserve"> for TV versus streaming.</w:t>
+        <w:t xml:space="preserve"> (the concept, the hook, and who it's for). You can't greenlight your own show without a pitch.</w:t>
       </w:r>
+    </w:p>
+    <w:tbl>
+      <w:tblPr>
+        <w:tblW w:type="auto" w:w="0"/>
+        <w:jc w:val="center"/>
+        <w:tblLook w:firstColumn="1" w:firstRow="1" w:lastColumn="0" w:lastRow="0" w:noHBand="0" w:noVBand="1" w:val="04A0"/>
+      </w:tblPr>
+      <w:tblGrid>
+        <w:gridCol w:w="9360"/>
+      </w:tblGrid>
+      <w:tr>
+        <w:tc>
+          <w:tcPr>
+            <w:tcW w:type="dxa" w:w="9360"/>
+            <w:shd w:val="clear" w:color="auto" w:fill="EEF6EC"/>
+          </w:tcPr>
+          <w:p>
+            <w:pPr>
+              <w:spacing w:before="60" w:after="60"/>
+            </w:pPr>
+            <w:r>
+              <w:rPr>
+                <w:b/>
+                <w:sz w:val="20"/>
+              </w:rPr>
+              <w:t xml:space="preserve">KEY IDEA:  </w:t>
+            </w:r>
+            <w:r>
+              <w:rPr>
+                <w:b/>
+              </w:rPr>
+              <w:t>3 new-show slots per year</w:t>
+            </w:r>
+            <w:r>
+              <w:rPr>
+                <w:b w:val="0"/>
+              </w:rPr>
+              <w:t>, shared between acquiring and building. You get 3 fresh slots each new year. There are more pitches than slots, so choose. Switching networks or restarting a level undoes the shows you added in it.</w:t>
+            </w:r>
+          </w:p>
+        </w:tc>
+      </w:tr>
+    </w:tbl>
+    <w:p>
+      <w:pPr>
+        <w:spacing w:after="0"/>
+      </w:pPr>
     </w:p>
     <w:p>
       <w:pPr>
@@ -2063,7 +2229,7 @@
         <w:rPr>
           <w:b w:val="0"/>
         </w:rPr>
-        <w:t>Pick or build a concept.</w:t>
+        <w:t>Pick or build a concept (and write its pitch if it's your own).</w:t>
       </w:r>
     </w:p>
     <w:p>
@@ -2142,6 +2308,18 @@
           <w:b/>
         </w:rPr>
         <w:t>immediately</w:t>
+      </w:r>
+      <w:r>
+        <w:rPr>
+          <w:b w:val="0"/>
+        </w:rPr>
+        <w:t xml:space="preserve">, and your pitch is shared on your class's </w:t>
+      </w:r>
+      <w:r>
+        <w:rPr>
+          <w:b/>
+        </w:rPr>
+        <w:t>📋 Pitch Board</w:t>
       </w:r>
       <w:r>
         <w:rPr>

</xml_diff>